<commit_message>
Refresh experiment 2 submission evidence
Co-Authored-By: Devin AI <158243242+devin-ai-integration[bot]@users.noreply.github.com>
</commit_message>
<xml_diff>
--- a/experiment2/report/实验二-TurtleBot4自主导航仿真-实验报告.docx
+++ b/experiment2/report/实验二-TurtleBot4自主导航仿真-实验报告.docx
@@ -181,7 +181,7 @@
           <w:rFonts w:ascii="宋体" w:hAnsi="宋体" w:eastAsia="宋体"/>
           <w:sz w:val="24"/>
         </w:rPr>
-        <w:t xml:space="preserve">2026 年 7 月 11 日</w:t>
+        <w:t xml:space="preserve">2026 年 7 月 12 日</w:t>
       </w:r>
       <w:r>
         <w:br w:type="page"/>
@@ -279,7 +279,7 @@
         <w:t xml:space="preserve"> </w:t>
       </w:r>
       <w:r>
-        <w:t xml:space="preserve">路径包含 189 个位姿，长度为 6.838 m，最大横向绕行为 2.425 m，路径绕过</w:t>
+        <w:t xml:space="preserve">路径包含 189 个位姿，长度为 6.872 m，最大横向绕行为 2.425 m，路径绕过</w:t>
       </w:r>
       <w:r>
         <w:t xml:space="preserve"> </w:t>
@@ -294,7 +294,7 @@
         <w:t xml:space="preserve"> </w:t>
       </w:r>
       <w:r>
-        <w:t xml:space="preserve">占用区域。相同 Nav2 目标 UUID 的动作状态由</w:t>
+        <w:t xml:space="preserve">占用区域。相同 Nav2 目标 UUID 的命令先返回</w:t>
       </w:r>
       <w:r>
         <w:t xml:space="preserve"> </w:t>
@@ -303,13 +303,10 @@
         <w:rPr>
           <w:rStyle w:val="VerbatimChar"/>
         </w:rPr>
-        <w:t xml:space="preserve">EXECUTING (2)</w:t>
-      </w:r>
-      <w:r>
-        <w:t xml:space="preserve"> </w:t>
-      </w:r>
-      <w:r>
-        <w:t xml:space="preserve">转为</w:t>
+        <w:t xml:space="preserve">Goal accepted</w:t>
+      </w:r>
+      <w:r>
+        <w:t xml:space="preserve">，终态为</w:t>
       </w:r>
       <w:r>
         <w:t xml:space="preserve"> </w:t>
@@ -321,7 +318,7 @@
         <w:t xml:space="preserve">SUCCEEDED (4)</w:t>
       </w:r>
       <w:r>
-        <w:t xml:space="preserve">，未出现</w:t>
+        <w:t xml:space="preserve">，未进入</w:t>
       </w:r>
       <w:r>
         <w:t xml:space="preserve"> </w:t>
@@ -333,7 +330,7 @@
         <w:t xml:space="preserve">ABORTED (6)</w:t>
       </w:r>
       <w:r>
-        <w:t xml:space="preserve">，机器人最终距目标 0.215 m。</w:t>
+        <w:t xml:space="preserve">；该终态同时证明目标检查器满足 0.25 m 位置容差。</w:t>
       </w:r>
     </w:p>
     <w:p>
@@ -348,34 +345,49 @@
         <w:t xml:space="preserve"> </w:t>
       </w:r>
       <w:r>
-        <w:t xml:space="preserve">增量为 4,858 个栅格，地图分辨率为 0.05 m/cell。受测试主机仅有约 2 个 CPU 核心</w:t>
-      </w:r>
-      <w:r>
-        <w:t xml:space="preserve"> </w:t>
-      </w:r>
-      <w:r>
-        <w:t xml:space="preserve">且使用 llvmpipe 软件渲染的限制，导航阶段曾出现一次超过 10 s 的仿真时钟监听间隙；</w:t>
-      </w:r>
-      <w:r>
-        <w:t xml:space="preserve"> </w:t>
-      </w:r>
-      <w:r>
-        <w:t xml:space="preserve">时钟随后恢复并继续递增，导航动作最终成功。该现象被作为性能限制保留，不影响</w:t>
-      </w:r>
-      <w:r>
-        <w:t xml:space="preserve"> </w:t>
-      </w:r>
-      <w:r>
-        <w:t xml:space="preserve">“</w:t>
-      </w:r>
-      <w:r>
-        <w:t xml:space="preserve">在 Ignition Gazebo 中实现 TurtleBot4 自主导航</w:t>
-      </w:r>
-      <w:r>
-        <w:t xml:space="preserve">”</w:t>
-      </w:r>
-      <w:r>
-        <w:t xml:space="preserve">的功能性结论。</w:t>
+        <w:t xml:space="preserve">增量为 4,858 个栅格，地图分辨率为 0.05 m/cell。VMware 测试主机配置约 6 vCPU、</w:t>
+      </w:r>
+      <w:r>
+        <w:t xml:space="preserve"> </w:t>
+      </w:r>
+      <w:r>
+        <w:t xml:space="preserve">7.7 GiB 内存且无独立 GPU；最终导航运行通过 120 s 的</w:t>
+      </w:r>
+      <w:r>
+        <w:t xml:space="preserve"> </w:t>
+      </w:r>
+      <w:r>
+        <w:rPr>
+          <w:rStyle w:val="VerbatimChar"/>
+        </w:rPr>
+        <w:t xml:space="preserve">/clock</w:t>
+      </w:r>
+      <w:r>
+        <w:t xml:space="preserve"> </w:t>
+      </w:r>
+      <w:r>
+        <w:t xml:space="preserve">与</w:t>
+      </w:r>
+      <w:r>
+        <w:t xml:space="preserve"> </w:t>
+      </w:r>
+      <w:r>
+        <w:rPr>
+          <w:rStyle w:val="VerbatimChar"/>
+        </w:rPr>
+        <w:t xml:space="preserve">/scan</w:t>
+      </w:r>
+      <w:r>
+        <w:t xml:space="preserve"> </w:t>
+      </w:r>
+      <w:r>
+        <w:t xml:space="preserve">启动验证。录屏中 RViz 曾短暂灰显并自行恢复，动作仍成功结束；该现象</w:t>
+      </w:r>
+      <w:r>
+        <w:t xml:space="preserve"> </w:t>
+      </w:r>
+      <w:r>
+        <w:t xml:space="preserve">作为软件渲染下的显示性能限制披露，不影响自主导航的功能性结论。</w:t>
       </w:r>
     </w:p>
     <w:p>
@@ -637,7 +649,7 @@
         </w:rPr>
         <w:t>3.3  AMCL 自定位</w:t>
         <w:tab/>
-        <w:t>7</w:t>
+        <w:t>6</w:t>
       </w:r>
     </w:p>
     <w:p>
@@ -694,7 +706,7 @@
         </w:rPr>
         <w:t>4  软件实现</w:t>
         <w:tab/>
-        <w:t>8</w:t>
+        <w:t>7</w:t>
       </w:r>
     </w:p>
     <w:p>
@@ -713,7 +725,7 @@
         </w:rPr>
         <w:t>4.1  代码包结构</w:t>
         <w:tab/>
-        <w:t>8</w:t>
+        <w:t>7</w:t>
       </w:r>
     </w:p>
     <w:p>
@@ -770,7 +782,7 @@
         </w:rPr>
         <w:t>5  实验步骤</w:t>
         <w:tab/>
-        <w:t>9</w:t>
+        <w:t>8</w:t>
       </w:r>
     </w:p>
     <w:p>
@@ -789,7 +801,7 @@
         </w:rPr>
         <w:t>5.1  编译与静态验证</w:t>
         <w:tab/>
-        <w:t>9</w:t>
+        <w:t>8</w:t>
       </w:r>
     </w:p>
     <w:p>
@@ -808,7 +820,7 @@
         </w:rPr>
         <w:t>5.2  SLAM 增量建图</w:t>
         <w:tab/>
-        <w:t>9</w:t>
+        <w:t>8</w:t>
       </w:r>
     </w:p>
     <w:p>
@@ -846,7 +858,7 @@
         </w:rPr>
         <w:t>5.4  发送导航目标</w:t>
         <w:tab/>
-        <w:t>10</w:t>
+        <w:t>9</w:t>
       </w:r>
     </w:p>
     <w:p>
@@ -941,7 +953,7 @@
         </w:rPr>
         <w:t>6.4  Nav2 导航终态</w:t>
         <w:tab/>
-        <w:t>16</w:t>
+        <w:t>15</w:t>
       </w:r>
     </w:p>
     <w:p>
@@ -960,7 +972,7 @@
         </w:rPr>
         <w:t>6.5  仿真时钟与低负载配置分析</w:t>
         <w:tab/>
-        <w:t>17</w:t>
+        <w:t>16</w:t>
       </w:r>
     </w:p>
     <w:p>
@@ -1017,7 +1029,7 @@
         </w:rPr>
         <w:t>7.2  RViz 视角确定性</w:t>
         <w:tab/>
-        <w:t>18</w:t>
+        <w:t>17</w:t>
       </w:r>
     </w:p>
     <w:p>
@@ -1034,9 +1046,28 @@
           <w:b w:val="0"/>
           <w:sz w:val="19"/>
         </w:rPr>
-        <w:t>7.3  后续优化方向</w:t>
+        <w:t>7.3  慢速主机的 lifecycle 启动顺序</w:t>
         <w:tab/>
-        <w:t>18</w:t>
+        <w:t>17</w:t>
+      </w:r>
+    </w:p>
+    <w:p>
+      <w:pPr>
+        <w:tabs>
+          <w:tab w:pos="8504" w:val="right" w:leader="dot"/>
+        </w:tabs>
+        <w:spacing w:before="0" w:after="0" w:line="360" w:lineRule="auto"/>
+        <w:ind w:left="420" w:firstLine="0"/>
+      </w:pPr>
+      <w:r>
+        <w:rPr>
+          <w:rFonts w:ascii="宋体" w:hAnsi="宋体" w:eastAsia="宋体"/>
+          <w:b w:val="0"/>
+          <w:sz w:val="19"/>
+        </w:rPr>
+        <w:t>7.4  后续优化方向</w:t>
+        <w:tab/>
+        <w:t>17</w:t>
       </w:r>
     </w:p>
     <w:p>
@@ -1055,7 +1086,7 @@
         </w:rPr>
         <w:t>8  结论</w:t>
         <w:tab/>
-        <w:t>18</w:t>
+        <w:t>17</w:t>
       </w:r>
     </w:p>
     <w:p>
@@ -1112,7 +1143,7 @@
         </w:rPr>
         <w:t>附录 B  报告生成方法</w:t>
         <w:tab/>
-        <w:t>20</w:t>
+        <w:t>19</w:t>
       </w:r>
       <w:r>
         <w:br w:type="page"/>
@@ -1271,7 +1302,7 @@
         <w:spacing w:line="360" w:lineRule="auto"/>
       </w:pPr>
       <w:r>
-        <w:t xml:space="preserve">采集地图、路径、动作状态和最终位姿等客观证据，分析实验结果。</w:t>
+        <w:t xml:space="preserve">采集地图、路径、动作终态和目标容差等客观证据，分析实验结果。</w:t>
       </w:r>
     </w:p>
     <w:p>
@@ -1782,7 +1813,7 @@
                 <w:b w:val="0"/>
                 <w:sz w:val="17"/>
               </w:rPr>
-              <w:t>约 2 vCPU、7.8 GiB 内存、无独立 GPU，OpenGL 使用 llvmpipe</w:t>
+              <w:t>约 6 vCPU、7.7 GiB 内存、无独立 GPU；RViz 使用 VMware SVGA3D，Gazebo 使用 Mesa llvmpipe</w:t>
             </w:r>
           </w:p>
         </w:tc>
@@ -5242,7 +5273,7 @@
         <w:spacing w:line="360" w:lineRule="auto"/>
       </w:pPr>
       <w:r>
-        <w:t xml:space="preserve">启动建图模式：</w:t>
+        <w:t xml:space="preserve">在 VMware 环境中使用低负载预设启动建图模式：</w:t>
       </w:r>
     </w:p>
     <w:p>
@@ -5265,7 +5296,7 @@
           <w:rFonts w:ascii="Consolas" w:hAnsi="Consolas" w:eastAsia="Consolas"/>
           <w:sz w:val="18"/>
         </w:rPr>
-        <w:t xml:space="preserve"> launch tb4_experiment_bringup simulation.launch.py slam:=true</w:t>
+        <w:t xml:space="preserve"> run tb4_experiment_bringup vmware_simulation slam:=true</w:t>
       </w:r>
     </w:p>
     <w:p>
@@ -5432,7 +5463,55 @@
         <w:spacing w:line="360" w:lineRule="auto"/>
       </w:pPr>
       <w:r>
-        <w:t xml:space="preserve">结束建图流程并完全关闭旧 Gazebo、RViz 与 ROS 2 launch 进程，重新启动导航模式：</w:t>
+        <w:t xml:space="preserve">结束建图流程并完全关闭旧 Gazebo、RViz 与 ROS 2 launch 进程。A* 导航验证独立使用</w:t>
+      </w:r>
+      <w:r>
+        <w:t xml:space="preserve"> </w:t>
+      </w:r>
+      <w:r>
+        <w:t xml:space="preserve">与 warehouse 世界严格匹配的官方静态地图；前述</w:t>
+      </w:r>
+      <w:r>
+        <w:t xml:space="preserve"> </w:t>
+      </w:r>
+      <w:r>
+        <w:rPr>
+          <w:rStyle w:val="VerbatimChar"/>
+        </w:rPr>
+        <w:t xml:space="preserve">lab_map</w:t>
+      </w:r>
+      <w:r>
+        <w:t xml:space="preserve"> </w:t>
+      </w:r>
+      <w:r>
+        <w:t xml:space="preserve">用于证明 SLAM</w:t>
+      </w:r>
+      <w:r>
+        <w:t xml:space="preserve"> </w:t>
+      </w:r>
+      <w:r>
+        <w:t xml:space="preserve">增量建图与保存，不把未完整探索的局部地图用于全局导航。为避免慢速虚拟机在 AMCL</w:t>
+      </w:r>
+      <w:r>
+        <w:t xml:space="preserve"> </w:t>
+      </w:r>
+      <w:r>
+        <w:t xml:space="preserve">建立</w:t>
+      </w:r>
+      <w:r>
+        <w:t xml:space="preserve"> </w:t>
+      </w:r>
+      <w:r>
+        <w:rPr>
+          <w:rStyle w:val="VerbatimChar"/>
+        </w:rPr>
+        <w:t xml:space="preserve">map -&gt; odom</w:t>
+      </w:r>
+      <w:r>
+        <w:t xml:space="preserve"> </w:t>
+      </w:r>
+      <w:r>
+        <w:t xml:space="preserve">前激活 Nav2，先只启动 Gazebo、AMCL 与 RViz：</w:t>
       </w:r>
     </w:p>
     <w:p>
@@ -5455,7 +5534,7 @@
           <w:rFonts w:ascii="Consolas" w:hAnsi="Consolas" w:eastAsia="Consolas"/>
           <w:sz w:val="18"/>
         </w:rPr>
-        <w:t xml:space="preserve"> launch tb4_experiment_bringup simulation.launch.py slam:=false</w:t>
+        <w:t xml:space="preserve"> run tb4_experiment_bringup vmware_simulation start_nav2:=false</w:t>
       </w:r>
     </w:p>
     <w:p>
@@ -5482,7 +5561,22 @@
         <w:t xml:space="preserve"> </w:t>
       </w:r>
       <w:r>
-        <w:t xml:space="preserve">LaserScan 与静态地图对齐。随后检查：</w:t>
+        <w:t xml:space="preserve">LaserScan 与静态地图对齐；确认</w:t>
+      </w:r>
+      <w:r>
+        <w:t xml:space="preserve"> </w:t>
+      </w:r>
+      <w:r>
+        <w:rPr>
+          <w:rStyle w:val="VerbatimChar"/>
+        </w:rPr>
+        <w:t xml:space="preserve">map -&gt; odom</w:t>
+      </w:r>
+      <w:r>
+        <w:t xml:space="preserve"> </w:t>
+      </w:r>
+      <w:r>
+        <w:t xml:space="preserve">有效后，在第二个终端启动 Nav2：</w:t>
       </w:r>
     </w:p>
     <w:p>
@@ -5493,6 +5587,30 @@
       </w:pPr>
       <w:r>
         <w:rPr>
+          <w:rStyle w:val="VariableTok"/>
+          <w:rFonts w:ascii="Consolas" w:hAnsi="Consolas" w:eastAsia="Consolas"/>
+          <w:sz w:val="18"/>
+        </w:rPr>
+        <w:t xml:space="preserve">PARAMS=</w:t>
+      </w:r>
+      <w:r>
+        <w:rPr>
+          <w:rStyle w:val="StringTok"/>
+          <w:rFonts w:ascii="Consolas" w:hAnsi="Consolas" w:eastAsia="Consolas"/>
+          <w:sz w:val="18"/>
+        </w:rPr>
+        <w:t xml:space="preserve">"</w:t>
+      </w:r>
+      <w:r>
+        <w:rPr>
+          <w:rStyle w:val="VariableTok"/>
+          <w:rFonts w:ascii="Consolas" w:hAnsi="Consolas" w:eastAsia="Consolas"/>
+          <w:sz w:val="18"/>
+        </w:rPr>
+        <w:t xml:space="preserve">$(</w:t>
+      </w:r>
+      <w:r>
+        <w:rPr>
           <w:rStyle w:val="ExtensionTok"/>
           <w:rFonts w:ascii="Consolas" w:hAnsi="Consolas" w:eastAsia="Consolas"/>
           <w:sz w:val="18"/>
@@ -5505,7 +5623,38 @@
           <w:rFonts w:ascii="Consolas" w:hAnsi="Consolas" w:eastAsia="Consolas"/>
           <w:sz w:val="18"/>
         </w:rPr>
-        <w:t xml:space="preserve"> param get /planner_server planner_plugins</w:t>
+        <w:t xml:space="preserve"> pkg prefix tb4_experiment_bringup</w:t>
+      </w:r>
+      <w:r>
+        <w:rPr>
+          <w:rStyle w:val="VariableTok"/>
+          <w:rFonts w:ascii="Consolas" w:hAnsi="Consolas" w:eastAsia="Consolas"/>
+          <w:sz w:val="18"/>
+        </w:rPr>
+        <w:t xml:space="preserve">)</w:t>
+      </w:r>
+      <w:r>
+        <w:rPr>
+          <w:rStyle w:val="StringTok"/>
+          <w:rFonts w:ascii="Consolas" w:hAnsi="Consolas" w:eastAsia="Consolas"/>
+          <w:sz w:val="18"/>
+        </w:rPr>
+        <w:t xml:space="preserve">/share/\</w:t>
+      </w:r>
+      <w:r>
+        <w:rPr>
+          <w:rFonts w:ascii="Consolas" w:hAnsi="Consolas" w:eastAsia="Consolas"/>
+          <w:sz w:val="18"/>
+        </w:rPr>
+        <w:br/>
+      </w:r>
+      <w:r>
+        <w:rPr>
+          <w:rStyle w:val="StringTok"/>
+          <w:rFonts w:ascii="Consolas" w:hAnsi="Consolas" w:eastAsia="Consolas"/>
+          <w:sz w:val="18"/>
+        </w:rPr>
+        <w:t xml:space="preserve">tb4_experiment_bringup/config/nav2_astar.yaml"</w:t>
       </w:r>
       <w:r>
         <w:rPr>
@@ -5528,14 +5677,30 @@
           <w:rFonts w:ascii="Consolas" w:hAnsi="Consolas" w:eastAsia="Consolas"/>
           <w:sz w:val="18"/>
         </w:rPr>
-        <w:t xml:space="preserve"> param get /planner_server GridBased.plugin</w:t>
-      </w:r>
-      <w:r>
-        <w:rPr>
+        <w:t xml:space="preserve"> launch turtlebot4_navigation nav2.launch.py </w:t>
+      </w:r>
+      <w:r>
+        <w:rPr>
+          <w:rStyle w:val="KeywordTok"/>
           <w:rFonts w:ascii="Consolas" w:hAnsi="Consolas" w:eastAsia="Consolas"/>
           <w:sz w:val="18"/>
         </w:rPr>
+        <w:t xml:space="preserve">\</w:t>
+      </w:r>
+      <w:r>
+        <w:rPr>
+          <w:rFonts w:ascii="Consolas" w:hAnsi="Consolas" w:eastAsia="Consolas"/>
+          <w:sz w:val="18"/>
+        </w:rPr>
         <w:br/>
+      </w:r>
+      <w:r>
+        <w:rPr>
+          <w:rStyle w:val="NormalTok"/>
+          <w:rFonts w:ascii="Consolas" w:hAnsi="Consolas" w:eastAsia="Consolas"/>
+          <w:sz w:val="18"/>
+        </w:rPr>
+        <w:t xml:space="preserve">  </w:t>
       </w:r>
       <w:r>
         <w:rPr>
@@ -5543,7 +5708,7 @@
           <w:rFonts w:ascii="Consolas" w:hAnsi="Consolas" w:eastAsia="Consolas"/>
           <w:sz w:val="18"/>
         </w:rPr>
-        <w:t xml:space="preserve">ros2</w:t>
+        <w:t xml:space="preserve">use_sim_time</w:t>
       </w:r>
       <w:r>
         <w:rPr>
@@ -5551,15 +5716,48 @@
           <w:rFonts w:ascii="Consolas" w:hAnsi="Consolas" w:eastAsia="Consolas"/>
           <w:sz w:val="18"/>
         </w:rPr>
-        <w:t xml:space="preserve"> lifecycle get /planner_server</w:t>
-      </w:r>
-      <w:r>
-        <w:rPr>
+        <w:t xml:space="preserve">:=true params_file:=</w:t>
+      </w:r>
+      <w:r>
+        <w:rPr>
+          <w:rStyle w:val="StringTok"/>
           <w:rFonts w:ascii="Consolas" w:hAnsi="Consolas" w:eastAsia="Consolas"/>
           <w:sz w:val="18"/>
         </w:rPr>
-        <w:br/>
-      </w:r>
+        <w:t xml:space="preserve">"</w:t>
+      </w:r>
+      <w:r>
+        <w:rPr>
+          <w:rStyle w:val="VariableTok"/>
+          <w:rFonts w:ascii="Consolas" w:hAnsi="Consolas" w:eastAsia="Consolas"/>
+          <w:sz w:val="18"/>
+        </w:rPr>
+        <w:t xml:space="preserve">$PARAMS</w:t>
+      </w:r>
+      <w:r>
+        <w:rPr>
+          <w:rStyle w:val="StringTok"/>
+          <w:rFonts w:ascii="Consolas" w:hAnsi="Consolas" w:eastAsia="Consolas"/>
+          <w:sz w:val="18"/>
+        </w:rPr>
+        <w:t xml:space="preserve">"</w:t>
+      </w:r>
+    </w:p>
+    <w:p>
+      <w:pPr>
+        <w:pStyle w:val="FirstParagraph"/>
+        <w:spacing w:line="360" w:lineRule="auto"/>
+      </w:pPr>
+      <w:r>
+        <w:t xml:space="preserve">随后检查：</w:t>
+      </w:r>
+    </w:p>
+    <w:p>
+      <w:pPr>
+        <w:pStyle w:val="SourceCode"/>
+        <w:spacing w:before="80" w:after="80"/>
+        <w:ind w:firstLine="0"/>
+      </w:pPr>
       <w:r>
         <w:rPr>
           <w:rStyle w:val="ExtensionTok"/>
@@ -5574,6 +5772,75 @@
           <w:rFonts w:ascii="Consolas" w:hAnsi="Consolas" w:eastAsia="Consolas"/>
           <w:sz w:val="18"/>
         </w:rPr>
+        <w:t xml:space="preserve"> param get /planner_server planner_plugins</w:t>
+      </w:r>
+      <w:r>
+        <w:rPr>
+          <w:rFonts w:ascii="Consolas" w:hAnsi="Consolas" w:eastAsia="Consolas"/>
+          <w:sz w:val="18"/>
+        </w:rPr>
+        <w:br/>
+      </w:r>
+      <w:r>
+        <w:rPr>
+          <w:rStyle w:val="ExtensionTok"/>
+          <w:rFonts w:ascii="Consolas" w:hAnsi="Consolas" w:eastAsia="Consolas"/>
+          <w:sz w:val="18"/>
+        </w:rPr>
+        <w:t xml:space="preserve">ros2</w:t>
+      </w:r>
+      <w:r>
+        <w:rPr>
+          <w:rStyle w:val="NormalTok"/>
+          <w:rFonts w:ascii="Consolas" w:hAnsi="Consolas" w:eastAsia="Consolas"/>
+          <w:sz w:val="18"/>
+        </w:rPr>
+        <w:t xml:space="preserve"> param get /planner_server GridBased.plugin</w:t>
+      </w:r>
+      <w:r>
+        <w:rPr>
+          <w:rFonts w:ascii="Consolas" w:hAnsi="Consolas" w:eastAsia="Consolas"/>
+          <w:sz w:val="18"/>
+        </w:rPr>
+        <w:br/>
+      </w:r>
+      <w:r>
+        <w:rPr>
+          <w:rStyle w:val="ExtensionTok"/>
+          <w:rFonts w:ascii="Consolas" w:hAnsi="Consolas" w:eastAsia="Consolas"/>
+          <w:sz w:val="18"/>
+        </w:rPr>
+        <w:t xml:space="preserve">ros2</w:t>
+      </w:r>
+      <w:r>
+        <w:rPr>
+          <w:rStyle w:val="NormalTok"/>
+          <w:rFonts w:ascii="Consolas" w:hAnsi="Consolas" w:eastAsia="Consolas"/>
+          <w:sz w:val="18"/>
+        </w:rPr>
+        <w:t xml:space="preserve"> lifecycle get /planner_server</w:t>
+      </w:r>
+      <w:r>
+        <w:rPr>
+          <w:rFonts w:ascii="Consolas" w:hAnsi="Consolas" w:eastAsia="Consolas"/>
+          <w:sz w:val="18"/>
+        </w:rPr>
+        <w:br/>
+      </w:r>
+      <w:r>
+        <w:rPr>
+          <w:rStyle w:val="ExtensionTok"/>
+          <w:rFonts w:ascii="Consolas" w:hAnsi="Consolas" w:eastAsia="Consolas"/>
+          <w:sz w:val="18"/>
+        </w:rPr>
+        <w:t xml:space="preserve">ros2</w:t>
+      </w:r>
+      <w:r>
+        <w:rPr>
+          <w:rStyle w:val="NormalTok"/>
+          <w:rFonts w:ascii="Consolas" w:hAnsi="Consolas" w:eastAsia="Consolas"/>
+          <w:sz w:val="18"/>
+        </w:rPr>
         <w:t xml:space="preserve"> topic info /plan -v</w:t>
       </w:r>
     </w:p>
@@ -5649,7 +5916,7 @@
         <w:spacing w:line="360" w:lineRule="auto"/>
       </w:pPr>
       <w:r>
-        <w:t xml:space="preserve">在 RViz 中使用</w:t>
+        <w:t xml:space="preserve">保持 RViz 显示地图和路径，在终端后台记录完整</w:t>
       </w:r>
       <w:r>
         <w:t xml:space="preserve"> </w:t>
@@ -5658,13 +5925,25 @@
         <w:rPr>
           <w:rStyle w:val="VerbatimChar"/>
         </w:rPr>
-        <w:t xml:space="preserve">Nav2 Goal</w:t>
-      </w:r>
-      <w:r>
-        <w:t xml:space="preserve"> </w:t>
-      </w:r>
-      <w:r>
-        <w:t xml:space="preserve">将目标设置为约</w:t>
+        <w:t xml:space="preserve">/plan</w:t>
+      </w:r>
+      <w:r>
+        <w:t xml:space="preserve">，再使用</w:t>
+      </w:r>
+      <w:r>
+        <w:t xml:space="preserve"> </w:t>
+      </w:r>
+      <w:r>
+        <w:rPr>
+          <w:rStyle w:val="VerbatimChar"/>
+        </w:rPr>
+        <w:t xml:space="preserve">ros2 action send_goal</w:t>
+      </w:r>
+      <w:r>
+        <w:t xml:space="preserve"> </w:t>
+      </w:r>
+      <w:r>
+        <w:t xml:space="preserve">将目标精确设置为</w:t>
       </w:r>
       <w:r>
         <w:t xml:space="preserve"> </w:t>
@@ -5696,7 +5975,7 @@
         <w:t xml:space="preserve"> </w:t>
       </w:r>
       <w:r>
-        <w:t xml:space="preserve">m，并持续记录</w:t>
+        <w:t xml:space="preserve">m。该方式与 RViz</w:t>
       </w:r>
       <w:r>
         <w:t xml:space="preserve"> </w:t>
@@ -5705,25 +5984,19 @@
         <w:rPr>
           <w:rStyle w:val="VerbatimChar"/>
         </w:rPr>
-        <w:t xml:space="preserve">/plan</w:t>
-      </w:r>
-      <w:r>
-        <w:t xml:space="preserve"> </w:t>
-      </w:r>
-      <w:r>
-        <w:t xml:space="preserve">与</w:t>
-      </w:r>
-      <w:r>
-        <w:t xml:space="preserve"> </w:t>
-      </w:r>
-      <w:r>
-        <w:rPr>
-          <w:rStyle w:val="VerbatimChar"/>
-        </w:rPr>
-        <w:t xml:space="preserve">/navigate_to_pose/_action/status</w:t>
-      </w:r>
-      <w:r>
-        <w:t xml:space="preserve">。验收条件包括：</w:t>
+        <w:t xml:space="preserve">Nav2 Goal</w:t>
+      </w:r>
+      <w:r>
+        <w:t xml:space="preserve"> </w:t>
+      </w:r>
+      <w:r>
+        <w:t xml:space="preserve">调用同一 action 接口，</w:t>
+      </w:r>
+      <w:r>
+        <w:t xml:space="preserve"> </w:t>
+      </w:r>
+      <w:r>
+        <w:t xml:space="preserve">并可在完整录屏中同时保留终端终态和 RViz 路径。验收条件包括：</w:t>
       </w:r>
     </w:p>
     <w:p>
@@ -5844,7 +6117,7 @@
         <w:spacing w:line="360" w:lineRule="auto"/>
       </w:pPr>
       <w:r>
-        <w:t xml:space="preserve">同一 UUID 经历</w:t>
+        <w:t xml:space="preserve">同一条 action 命令先显示</w:t>
       </w:r>
       <w:r>
         <w:t xml:space="preserve"> </w:t>
@@ -5853,13 +6126,10 @@
         <w:rPr>
           <w:rStyle w:val="VerbatimChar"/>
         </w:rPr>
-        <w:t xml:space="preserve">EXECUTING (2)</w:t>
-      </w:r>
-      <w:r>
-        <w:t xml:space="preserve"> </w:t>
-      </w:r>
-      <w:r>
-        <w:t xml:space="preserve">并进入</w:t>
+        <w:t xml:space="preserve">Goal accepted</w:t>
+      </w:r>
+      <w:r>
+        <w:t xml:space="preserve">，最终进入</w:t>
       </w:r>
       <w:r>
         <w:t xml:space="preserve"> </w:t>
@@ -5895,7 +6165,7 @@
         <w:spacing w:line="360" w:lineRule="auto"/>
       </w:pPr>
       <w:r>
-        <w:t xml:space="preserve">最终机器人至目标距离不大于 0.35 m。</w:t>
+        <w:t xml:space="preserve">Nav2 目标检查器在配置的 0.25 m 位置容差内通过。</w:t>
       </w:r>
     </w:p>
     <w:p>
@@ -6932,13 +7202,13 @@
         <w:spacing w:line="360" w:lineRule="auto"/>
       </w:pPr>
       <w:r>
-        <w:t xml:space="preserve">图 6 中 Navigation 与 Localization 均处于 active 状态，粒子云集中于</w:t>
-      </w:r>
-      <w:r>
-        <w:t xml:space="preserve"> </w:t>
-      </w:r>
-      <w:r>
-        <w:t xml:space="preserve">机器人附近，激光点与 warehouse 静态地图边缘对齐。采集的</w:t>
+        <w:t xml:space="preserve">图 6 为本次最终复现实验的初始导航界面，Navigation 与 Localization 均处于</w:t>
+      </w:r>
+      <w:r>
+        <w:t xml:space="preserve"> </w:t>
+      </w:r>
+      <w:r>
+        <w:t xml:space="preserve">active 状态，机器人初始位姿和 warehouse 静态地图清晰可见。终端采样确认</w:t>
       </w:r>
       <w:r>
         <w:t xml:space="preserve"> </w:t>
@@ -6947,46 +7217,13 @@
         <w:rPr>
           <w:rStyle w:val="VerbatimChar"/>
         </w:rPr>
-        <w:t xml:space="preserve">/amcl_pose</w:t>
-      </w:r>
-      <w:r>
-        <w:t xml:space="preserve"> </w:t>
-      </w:r>
-      <w:r>
-        <w:t xml:space="preserve">消息 frame 为</w:t>
-      </w:r>
-      <w:r>
-        <w:t xml:space="preserve"> </w:t>
-      </w:r>
-      <w:r>
-        <w:rPr>
-          <w:rStyle w:val="VerbatimChar"/>
-        </w:rPr>
-        <w:t xml:space="preserve">map</w:t>
-      </w:r>
-      <w:r>
-        <w:t xml:space="preserve">，且</w:t>
-      </w:r>
-      <w:r>
-        <w:t xml:space="preserve"> </w:t>
-      </w:r>
-      <w:r>
-        <w:rPr>
-          <w:rStyle w:val="VerbatimChar"/>
-        </w:rPr>
         <w:t xml:space="preserve">map -&gt; odom -&gt; base_link</w:t>
       </w:r>
       <w:r>
         <w:t xml:space="preserve"> </w:t>
       </w:r>
       <w:r>
-        <w:t xml:space="preserve">TF 链有效，</w:t>
-      </w:r>
-      <w:r>
-        <w:t xml:space="preserve"> </w:t>
-      </w:r>
-      <w:r>
-        <w:t xml:space="preserve">满足全局规划的坐标基础。</w:t>
+        <w:t xml:space="preserve">TF 链持续有效，满足全局规划的坐标基础。</w:t>
       </w:r>
     </w:p>
     <w:p>
@@ -6997,9 +7234,9 @@
       <w:r>
         <w:drawing>
           <wp:inline>
-            <wp:extent cx="5613400" cy="4210050"/>
+            <wp:extent cx="5308429" cy="2712515"/>
             <wp:effectExtent b="0" l="0" r="0" t="0"/>
-            <wp:docPr descr="通过 RViz 设定初始位姿后的 AMCL 收敛状态" title="" id="1" name="Picture"/>
+            <wp:docPr descr="最终复现实验的 AMCL 初始定位与导航激活界面" title="" id="1" name="Picture"/>
             <a:graphic>
               <a:graphicData uri="http://schemas.openxmlformats.org/drawingml/2006/picture">
                 <pic:pic>
@@ -7018,7 +7255,7 @@
                   <pic:spPr bwMode="auto">
                     <a:xfrm>
                       <a:off x="0" y="0"/>
-                      <a:ext cx="5613400" cy="4210050"/>
+                      <a:ext cx="5308429" cy="2712515"/>
                     </a:xfrm>
                     <a:prstGeom prst="rect">
                       <a:avLst/>
@@ -7045,7 +7282,7 @@
         <w:jc w:val="center"/>
       </w:pPr>
       <w:r>
-        <w:t>图 6  通过 RViz 设定初始位姿后的 AMCL 收敛状态</w:t>
+        <w:t>图 6  最终复现实验的 AMCL 初始定位与导航激活界面</w:t>
       </w:r>
     </w:p>
     <w:p>
@@ -7162,7 +7399,7 @@
       <w:r>
         <w:drawing>
           <wp:inline>
-            <wp:extent cx="5613400" cy="5122270"/>
+            <wp:extent cx="5613400" cy="5197719"/>
             <wp:effectExtent b="0" l="0" r="0" t="0"/>
             <wp:docPr descr="A* 全局路径与 shelf_7 绕障判定" title="" id="1" name="Picture"/>
             <a:graphic>
@@ -7183,7 +7420,7 @@
                   <pic:spPr bwMode="auto">
                     <a:xfrm>
                       <a:off x="0" y="0"/>
-                      <a:ext cx="5613400" cy="5122270"/>
+                      <a:ext cx="5613400" cy="5197719"/>
                     </a:xfrm>
                     <a:prstGeom prst="rect">
                       <a:avLst/>
@@ -7221,9 +7458,9 @@
       <w:r>
         <w:drawing>
           <wp:inline>
-            <wp:extent cx="5613400" cy="4210050"/>
+            <wp:extent cx="5613400" cy="2868780"/>
             <wp:effectExtent b="0" l="0" r="0" t="0"/>
-            <wp:docPr descr="RViz 中的 A* 路径与导航执行状态" title="" id="1" name="Picture"/>
+            <wp:docPr descr="完整导航录屏中的 A* 全局路径与执行状态" title="" id="1" name="Picture"/>
             <a:graphic>
               <a:graphicData uri="http://schemas.openxmlformats.org/drawingml/2006/picture">
                 <pic:pic>
@@ -7242,7 +7479,7 @@
                   <pic:spPr bwMode="auto">
                     <a:xfrm>
                       <a:off x="0" y="0"/>
-                      <a:ext cx="5613400" cy="4210050"/>
+                      <a:ext cx="5613400" cy="2868780"/>
                     </a:xfrm>
                     <a:prstGeom prst="rect">
                       <a:avLst/>
@@ -7269,7 +7506,7 @@
         <w:jc w:val="center"/>
       </w:pPr>
       <w:r>
-        <w:t>图 8  RViz 中的 A* 路径与导航执行状态</w:t>
+        <w:t>图 8  完整导航录屏中的 A* 全局路径与执行状态</w:t>
       </w:r>
     </w:p>
     <w:bookmarkStart w:id="68" w:name="tab:path-results"/>
@@ -7479,7 +7716,7 @@
                 <w:b w:val="0"/>
                 <w:sz w:val="17"/>
               </w:rPr>
-              <w:t>(-0.005, -0.068) m</w:t>
+              <w:t>(0.000, 0.000) m</w:t>
             </w:r>
           </w:p>
         </w:tc>
@@ -7500,7 +7737,7 @@
                 <w:b w:val="0"/>
                 <w:sz w:val="17"/>
               </w:rPr>
-              <w:t>靠近机器人</w:t>
+              <w:t>与机器人初始位姿一致</w:t>
             </w:r>
           </w:p>
         </w:tc>
@@ -7615,7 +7852,7 @@
                 <w:b w:val="0"/>
                 <w:sz w:val="17"/>
               </w:rPr>
-              <w:t>6.838 m</w:t>
+              <w:t>6.872 m</w:t>
             </w:r>
           </w:p>
         </w:tc>
@@ -7871,7 +8108,7 @@
         <w:rPr>
           <w:rStyle w:val="VerbatimChar"/>
         </w:rPr>
-        <w:t xml:space="preserve">45d5...0d3e</w:t>
+        <w:t xml:space="preserve">1b1c...59f1</w:t>
       </w:r>
       <w:r>
         <w:t xml:space="preserve">，完整值保存在提交包的 action 数据文件中。</w:t>
@@ -7880,7 +8117,7 @@
         <w:t xml:space="preserve"> </w:t>
       </w:r>
       <w:r>
-        <w:t xml:space="preserve">监听到的状态序列为</w:t>
+        <w:t xml:space="preserve">同一条</w:t>
       </w:r>
       <w:r>
         <w:t xml:space="preserve"> </w:t>
@@ -7889,16 +8126,14 @@
         <w:rPr>
           <w:rStyle w:val="VerbatimChar"/>
         </w:rPr>
-        <w:t xml:space="preserve">EXECUTING (2)</w:t>
-      </w:r>
-      <w:r>
-        <w:t xml:space="preserve"> </w:t>
-      </w:r>
-      <m:oMath>
-        <m:r>
-          <m:t>→</m:t>
-        </m:r>
-      </m:oMath>
+        <w:t xml:space="preserve">ros2 action send_goal</w:t>
+      </w:r>
+      <w:r>
+        <w:t xml:space="preserve"> </w:t>
+      </w:r>
+      <w:r>
+        <w:t xml:space="preserve">命令先显示</w:t>
+      </w:r>
       <w:r>
         <w:t xml:space="preserve"> </w:t>
       </w:r>
@@ -7906,16 +8141,10 @@
         <w:rPr>
           <w:rStyle w:val="VerbatimChar"/>
         </w:rPr>
-        <w:t xml:space="preserve">SUCCEEDED (4)</w:t>
-      </w:r>
-      <w:r>
-        <w:t xml:space="preserve">，</w:t>
-      </w:r>
-      <w:r>
-        <w:t xml:space="preserve"> </w:t>
-      </w:r>
-      <w:r>
-        <w:t xml:space="preserve">相同 UUID 未出现</w:t>
+        <w:t xml:space="preserve">Goal accepted</w:t>
+      </w:r>
+      <w:r>
+        <w:t xml:space="preserve">，随后返回</w:t>
       </w:r>
       <w:r>
         <w:t xml:space="preserve"> </w:t>
@@ -7924,86 +8153,40 @@
         <w:rPr>
           <w:rStyle w:val="VerbatimChar"/>
         </w:rPr>
+        <w:t xml:space="preserve">Goal finished with status: SUCCEEDED</w:t>
+      </w:r>
+      <w:r>
+        <w:t xml:space="preserve">，对应终态码 4，未进入</w:t>
+      </w:r>
+      <w:r>
+        <w:t xml:space="preserve"> </w:t>
+      </w:r>
+      <w:r>
+        <w:rPr>
+          <w:rStyle w:val="VerbatimChar"/>
+        </w:rPr>
         <w:t xml:space="preserve">ABORTED (6)</w:t>
       </w:r>
       <w:r>
-        <w:t xml:space="preserve">。最终机器人位置为</w:t>
-      </w:r>
-      <w:r>
-        <w:t xml:space="preserve"> </w:t>
-      </w:r>
-      <m:oMath>
-        <m:r>
-          <m:t>(</m:t>
-        </m:r>
-        <m:r>
-          <m:t>−</m:t>
-        </m:r>
-        <m:r>
-          <m:t>0.204</m:t>
-        </m:r>
-        <m:r>
-          <m:t>,</m:t>
-        </m:r>
-        <m:r>
-          <m:t>−</m:t>
-        </m:r>
-        <m:r>
-          <m:t>3.716</m:t>
-        </m:r>
-        <m:r>
-          <m:t>)</m:t>
-        </m:r>
-      </m:oMath>
-      <w:r>
-        <w:t xml:space="preserve"> </w:t>
-      </w:r>
-      <w:r>
-        <w:t xml:space="preserve">m，目标位置为</w:t>
-      </w:r>
-      <w:r>
-        <w:t xml:space="preserve"> </w:t>
-      </w:r>
-      <m:oMath>
-        <m:r>
-          <m:t>(</m:t>
-        </m:r>
-        <m:r>
-          <m:t>−</m:t>
-        </m:r>
-        <m:r>
-          <m:t>0.149</m:t>
-        </m:r>
-        <m:r>
-          <m:t>,</m:t>
-        </m:r>
-        <m:r>
-          <m:t>−</m:t>
-        </m:r>
-        <m:r>
-          <m:t>3.924</m:t>
-        </m:r>
-        <m:r>
-          <m:t>)</m:t>
-        </m:r>
-      </m:oMath>
-      <w:r>
-        <w:t xml:space="preserve"> </w:t>
-      </w:r>
-      <w:r>
-        <w:t xml:space="preserve">m；按平面欧氏距离计算，</w:t>
-      </w:r>
-      <w:r>
-        <w:t xml:space="preserve"> </w:t>
-      </w:r>
-      <w:r>
-        <w:t xml:space="preserve">二者相距 0.215 m，</w:t>
-      </w:r>
-      <w:r>
-        <w:t xml:space="preserve"> </w:t>
-      </w:r>
-      <w:r>
-        <w:t xml:space="preserve">小于 0.35 m 验收阈值，也小于 Nav2 配置的 0.25 m 位置容差。</w:t>
+        <w:t xml:space="preserve">。本次录屏没有同步保存终态 TF 数值，因此报告不沿用其他运行的</w:t>
+      </w:r>
+      <w:r>
+        <w:t xml:space="preserve"> </w:t>
+      </w:r>
+      <w:r>
+        <w:t xml:space="preserve">精确距离；</w:t>
+      </w:r>
+      <w:r>
+        <w:rPr>
+          <w:rStyle w:val="VerbatimChar"/>
+        </w:rPr>
+        <w:t xml:space="preserve">SUCCEEDED</w:t>
+      </w:r>
+      <w:r>
+        <w:t xml:space="preserve"> </w:t>
+      </w:r>
+      <w:r>
+        <w:t xml:space="preserve">证明 Nav2 目标检查器已在配置的 0.25 m 位置容差内通过。</w:t>
       </w:r>
     </w:p>
     <w:p>
@@ -8014,9 +8197,9 @@
       <w:r>
         <w:drawing>
           <wp:inline>
-            <wp:extent cx="5613400" cy="4210050"/>
+            <wp:extent cx="5613400" cy="2868780"/>
             <wp:effectExtent b="0" l="0" r="0" t="0"/>
-            <wp:docPr descr="Nav2 到达目标：Feedback 为 reached，剩余距离为 0.00 m" title="" id="1" name="Picture"/>
+            <wp:docPr descr="自主导航终态：NavigateToPose action 返回 SUCCEEDED" title="" id="1" name="Picture"/>
             <a:graphic>
               <a:graphicData uri="http://schemas.openxmlformats.org/drawingml/2006/picture">
                 <pic:pic>
@@ -8035,7 +8218,7 @@
                   <pic:spPr bwMode="auto">
                     <a:xfrm>
                       <a:off x="0" y="0"/>
-                      <a:ext cx="5613400" cy="4210050"/>
+                      <a:ext cx="5613400" cy="2868780"/>
                     </a:xfrm>
                     <a:prstGeom prst="rect">
                       <a:avLst/>
@@ -8062,7 +8245,7 @@
         <w:jc w:val="center"/>
       </w:pPr>
       <w:r>
-        <w:t>图 9  Nav2 到达目标：Feedback 为 reached，剩余距离为 0.00 m</w:t>
+        <w:t>图 9  自主导航终态：NavigateToPose action 返回 SUCCEEDED</w:t>
       </w:r>
     </w:p>
     <w:bookmarkStart w:id="72" w:name="tab:final-results"/>
@@ -8476,7 +8659,7 @@
                 <w:b w:val="0"/>
                 <w:sz w:val="17"/>
               </w:rPr>
-              <w:t>同一 UUID：2 → 4</w:t>
+              <w:t>同一 UUID：accepted → SUCCEEDED (4)</w:t>
             </w:r>
           </w:p>
         </w:tc>
@@ -8523,7 +8706,7 @@
                 <w:b w:val="0"/>
                 <w:sz w:val="17"/>
               </w:rPr>
-              <w:t>最终目标距离</w:t>
+              <w:t>目标位置容差</w:t>
             </w:r>
           </w:p>
         </w:tc>
@@ -8544,7 +8727,7 @@
                 <w:b w:val="0"/>
                 <w:sz w:val="17"/>
               </w:rPr>
-              <w:t>0.215 m</w:t>
+              <w:t>0.25 m goal checker 已通过</w:t>
             </w:r>
           </w:p>
         </w:tc>
@@ -8591,7 +8774,7 @@
                 <w:b w:val="0"/>
                 <w:sz w:val="17"/>
               </w:rPr>
-              <w:t>仿真时钟严格连续性</w:t>
+              <w:t>/clock 与 /scan 启动验证</w:t>
             </w:r>
           </w:p>
         </w:tc>
@@ -8612,7 +8795,7 @@
                 <w:b w:val="0"/>
                 <w:sz w:val="17"/>
               </w:rPr>
-              <w:t>出现一次 &gt;10 s 监听间隙，随后恢复</w:t>
+              <w:t>连续观察 120 s，watchdog 已启用</w:t>
             </w:r>
           </w:p>
         </w:tc>
@@ -8633,7 +8816,7 @@
                 <w:b w:val="0"/>
                 <w:sz w:val="17"/>
               </w:rPr>
-              <w:t>性能项未通过</w:t>
+              <w:t>通过</w:t>
             </w:r>
           </w:p>
         </w:tc>
@@ -8673,13 +8856,7 @@
         <w:t xml:space="preserve">ok</w:t>
       </w:r>
       <w:r>
-        <w:t xml:space="preserve">。导航流程在 303.2 s 墙钟内接收 627 个样本，监视器最后</w:t>
-      </w:r>
-      <w:r>
-        <w:t xml:space="preserve"> </w:t>
-      </w:r>
-      <w:r>
-        <w:t xml:space="preserve">记录到 74.1 s，并因连续超过 10 s 未收到回调而标记为</w:t>
+        <w:t xml:space="preserve">。最终导航复现实验由</w:t>
       </w:r>
       <w:r>
         <w:t xml:space="preserve"> </w:t>
@@ -8688,16 +8865,55 @@
         <w:rPr>
           <w:rStyle w:val="VerbatimChar"/>
         </w:rPr>
-        <w:t xml:space="preserve">stalled</w:t>
-      </w:r>
-      <w:r>
-        <w:t xml:space="preserve">；之后独立采样</w:t>
-      </w:r>
-      <w:r>
-        <w:t xml:space="preserve"> </w:t>
-      </w:r>
-      <w:r>
-        <w:t xml:space="preserve">得到 103.2 s，证明 Gazebo 时钟恢复而非永久停止，机器人也继续运动直至 action 成功。</w:t>
+        <w:t xml:space="preserve">vmware_simulation_validator</w:t>
+      </w:r>
+      <w:r>
+        <w:t xml:space="preserve"> </w:t>
+      </w:r>
+      <w:r>
+        <w:t xml:space="preserve">连续观察 120 s 墙钟，确认</w:t>
+      </w:r>
+      <w:r>
+        <w:t xml:space="preserve"> </w:t>
+      </w:r>
+      <w:r>
+        <w:rPr>
+          <w:rStyle w:val="VerbatimChar"/>
+        </w:rPr>
+        <w:t xml:space="preserve">/clock</w:t>
+      </w:r>
+      <w:r>
+        <w:t xml:space="preserve"> </w:t>
+      </w:r>
+      <w:r>
+        <w:t xml:space="preserve">推进，且</w:t>
+      </w:r>
+      <w:r>
+        <w:t xml:space="preserve"> </w:t>
+      </w:r>
+      <w:r>
+        <w:rPr>
+          <w:rStyle w:val="VerbatimChar"/>
+        </w:rPr>
+        <w:t xml:space="preserve">/scan</w:t>
+      </w:r>
+      <w:r>
+        <w:t xml:space="preserve"> </w:t>
+      </w:r>
+      <w:r>
+        <w:t xml:space="preserve">含 1.339–11.997 m 的环境回波；通过后 15 s 停钟 watchdog</w:t>
+      </w:r>
+      <w:r>
+        <w:t xml:space="preserve"> </w:t>
+      </w:r>
+      <w:r>
+        <w:t xml:space="preserve">继续运行。提交数据只将已保存的 120 s 检查记为严格通过，不以动作成功替代未单独</w:t>
+      </w:r>
+      <w:r>
+        <w:t xml:space="preserve"> </w:t>
+      </w:r>
+      <w:r>
+        <w:t xml:space="preserve">保存的全程时钟采样。</w:t>
       </w:r>
     </w:p>
     <w:p>
@@ -8706,19 +8922,25 @@
         <w:spacing w:line="360" w:lineRule="auto"/>
       </w:pPr>
       <w:r>
-        <w:t xml:space="preserve">10 s 是监控判定阈值，不是 Gazebo 的运行上限，也不会主动造成时钟停顿。本机仅约</w:t>
-      </w:r>
-      <w:r>
-        <w:t xml:space="preserve"> </w:t>
-      </w:r>
-      <w:r>
-        <w:t xml:space="preserve">2 vCPU 且无硬件 OpenGL，Gazebo 传感器计算与 RViz costmap、粒子云渲染竞争 CPU，</w:t>
-      </w:r>
-      <w:r>
-        <w:t xml:space="preserve"> </w:t>
-      </w:r>
-      <w:r>
-        <w:t xml:space="preserve">导致实时率显著低于 1。为获得可完成的端到端实验，证据采集使用了以下临时低负载配置：</w:t>
+        <w:t xml:space="preserve">本机约 6 vCPU、7.7 GiB 内存且无独立 GPU。Gazebo 软件渲染、RPLIDAR、</w:t>
+      </w:r>
+      <w:r>
+        <w:t xml:space="preserve"> </w:t>
+      </w:r>
+      <w:r>
+        <w:t xml:space="preserve">AMCL、两套 costmap 与 RViz 同时运行时仍会竞争 CPU 和虚拟 GPU；录屏中 RViz</w:t>
+      </w:r>
+      <w:r>
+        <w:t xml:space="preserve"> </w:t>
+      </w:r>
+      <w:r>
+        <w:t xml:space="preserve">曾短暂灰显后自行恢复，路径显示和 action 执行没有中断。为获得可完成的端到端实验，</w:t>
+      </w:r>
+      <w:r>
+        <w:t xml:space="preserve"> </w:t>
+      </w:r>
+      <w:r>
+        <w:t xml:space="preserve">证据采集使用了以下低负载配置：</w:t>
       </w:r>
     </w:p>
     <w:p>
@@ -8742,7 +8964,13 @@
         <w:spacing w:line="360" w:lineRule="auto"/>
       </w:pPr>
       <w:r>
-        <w:t xml:space="preserve">OAK-D 仿真更新关闭，因为本实验的 SLAM/Nav2 使用 RPLIDAR；</w:t>
+        <w:t xml:space="preserve">OAK-D 停用；关闭 Create 3 cliff/IR GPU lidar 及其 ROS 桥接，因为导航使用</w:t>
+      </w:r>
+      <w:r>
+        <w:t xml:space="preserve"> </w:t>
+      </w:r>
+      <w:r>
+        <w:t xml:space="preserve">RPLIDAR；</w:t>
       </w:r>
     </w:p>
     <w:p>
@@ -8778,7 +9006,13 @@
         <w:spacing w:line="360" w:lineRule="auto"/>
       </w:pPr>
       <w:r>
-        <w:t xml:space="preserve">关闭 Gazebo 射线绘制，以及完成相应证据后关闭部分 RViz 视觉叠层；</w:t>
+        <w:t xml:space="preserve">不生成充电底座，不启动 TurtleBot4 HMI/传感器 lifecycle，保留 Create 3</w:t>
+      </w:r>
+      <w:r>
+        <w:t xml:space="preserve"> </w:t>
+      </w:r>
+      <w:r>
+        <w:t xml:space="preserve">运动控制、里程计和 TF；</w:t>
       </w:r>
     </w:p>
     <w:p>
@@ -8790,7 +9024,7 @@
         <w:spacing w:line="360" w:lineRule="auto"/>
       </w:pPr>
       <w:r>
-        <w:t xml:space="preserve">临时 world 的</w:t>
+        <w:t xml:space="preserve">临时 world 使用</w:t>
       </w:r>
       <w:r>
         <w:t xml:space="preserve"> </w:t>
@@ -8799,17 +9033,53 @@
         <w:rPr>
           <w:rStyle w:val="VerbatimChar"/>
         </w:rPr>
-        <w:t xml:space="preserve">max_step_size</w:t>
-      </w:r>
-      <w:r>
-        <w:t xml:space="preserve"> </w:t>
-      </w:r>
-      <w:r>
-        <w:t xml:space="preserve">设为 0.1 s，以降低物理计算量。</w:t>
+        <w:t xml:space="preserve">max_step_size=0.01 s</w:t>
+      </w:r>
+      <w:r>
+        <w:t xml:space="preserve">、</w:t>
+      </w:r>
+      <w:r>
+        <w:t xml:space="preserve"> </w:t>
+      </w:r>
+      <w:r>
+        <w:rPr>
+          <w:rStyle w:val="VerbatimChar"/>
+        </w:rPr>
+        <w:t xml:space="preserve">real_time_update_rate=20 Hz</w:t>
+      </w:r>
+      <w:r>
+        <w:t xml:space="preserve"> </w:t>
+      </w:r>
+      <w:r>
+        <w:t xml:space="preserve">与</w:t>
+      </w:r>
+      <w:r>
+        <w:t xml:space="preserve"> </w:t>
+      </w:r>
+      <w:r>
+        <w:rPr>
+          <w:rStyle w:val="VerbatimChar"/>
+        </w:rPr>
+        <w:t xml:space="preserve">real_time_factor=0.2</w:t>
+      </w:r>
+      <w:r>
+        <w:t xml:space="preserve">；</w:t>
       </w:r>
     </w:p>
     <w:p>
       <w:pPr>
+        <w:numPr>
+          <w:ilvl w:val="0"/>
+          <w:numId w:val="1005"/>
+        </w:numPr>
+        <w:spacing w:line="360" w:lineRule="auto"/>
+      </w:pPr>
+      <w:r>
+        <w:t xml:space="preserve">Create 3 controller 更新率设为 100 Hz，里程计发布率设为 20 Hz。</w:t>
+      </w:r>
+    </w:p>
+    <w:p>
+      <w:pPr>
         <w:pStyle w:val="FirstParagraph"/>
         <w:spacing w:line="360" w:lineRule="auto"/>
       </w:pPr>
@@ -9057,7 +9327,79 @@
         <w:ind w:firstLine="0"/>
       </w:pPr>
       <w:r>
-        <w:t>7.3  后续优化方向</w:t>
+        <w:t>7.3  慢速主机的 lifecycle 启动顺序</w:t>
+      </w:r>
+    </w:p>
+    <w:p>
+      <w:pPr>
+        <w:pStyle w:val="FirstParagraph"/>
+        <w:spacing w:line="360" w:lineRule="auto"/>
+      </w:pPr>
+      <w:r>
+        <w:t xml:space="preserve">若 Nav2 抢在 AMCL 初始位姿前激活，Controller Server 可能在等待</w:t>
+      </w:r>
+      <w:r>
+        <w:t xml:space="preserve"> </w:t>
+      </w:r>
+      <w:r>
+        <w:rPr>
+          <w:rStyle w:val="VerbatimChar"/>
+        </w:rPr>
+        <w:t xml:space="preserve">map -&gt; odom</w:t>
+      </w:r>
+      <w:r>
+        <w:t xml:space="preserve"> </w:t>
+      </w:r>
+      <w:r>
+        <w:t xml:space="preserve">时停留于 inactive。最终流程使用</w:t>
+      </w:r>
+      <w:r>
+        <w:t xml:space="preserve"> </w:t>
+      </w:r>
+      <w:r>
+        <w:rPr>
+          <w:rStyle w:val="VerbatimChar"/>
+        </w:rPr>
+        <w:t xml:space="preserve">start_nav2:=false</w:t>
+      </w:r>
+      <w:r>
+        <w:t xml:space="preserve"> </w:t>
+      </w:r>
+      <w:r>
+        <w:t xml:space="preserve">先建立定位 TF，再单独启动 Nav2；Planner、Controller</w:t>
+      </w:r>
+      <w:r>
+        <w:t xml:space="preserve"> </w:t>
+      </w:r>
+      <w:r>
+        <w:t xml:space="preserve">和 BT Navigator 随后均进入</w:t>
+      </w:r>
+      <w:r>
+        <w:t xml:space="preserve"> </w:t>
+      </w:r>
+      <w:r>
+        <w:rPr>
+          <w:rStyle w:val="VerbatimChar"/>
+        </w:rPr>
+        <w:t xml:space="preserve">active [3]</w:t>
+      </w:r>
+      <w:r>
+        <w:t xml:space="preserve">。该分阶段顺序避免把 lifecycle</w:t>
+      </w:r>
+      <w:r>
+        <w:t xml:space="preserve"> </w:t>
+      </w:r>
+      <w:r>
+        <w:t xml:space="preserve">阻塞误判为 A* 算法错误。</w:t>
+      </w:r>
+    </w:p>
+    <w:p>
+      <w:pPr>
+        <w:pStyle w:val="Heading2"/>
+        <w:ind w:firstLine="0"/>
+      </w:pPr>
+      <w:r>
+        <w:t>7.4  后续优化方向</w:t>
       </w:r>
     </w:p>
     <w:p>
@@ -9069,7 +9411,7 @@
         <w:spacing w:line="360" w:lineRule="auto"/>
       </w:pPr>
       <w:r>
-        <w:t xml:space="preserve">以 lifecycle 状态或进程事件替代固定 5 s 的启动延时，提高慢速主机稳定性；</w:t>
+        <w:t xml:space="preserve">在统一 launch 中以 TF/lifecycle 条件自动执行当前的分阶段 Nav2 启动；</w:t>
       </w:r>
     </w:p>
     <w:p>
@@ -9195,7 +9537,7 @@
         <w:t xml:space="preserve"> </w:t>
       </w:r>
       <w:r>
-        <w:t xml:space="preserve">A* 路径包含 189 个位姿、长度 6.838 m，并以 2.425 m 的横向绕行避开</w:t>
+        <w:t xml:space="preserve">A* 路径包含 189 个位姿、长度 6.872 m，并以 2.425 m 的横向绕行避开</w:t>
       </w:r>
       <w:r>
         <w:t xml:space="preserve"> </w:t>
@@ -9207,7 +9549,7 @@
         <w:t xml:space="preserve">shelf_7</w:t>
       </w:r>
       <w:r>
-        <w:t xml:space="preserve">；Nav2 同一目标 UUID 从</w:t>
+        <w:t xml:space="preserve">；Nav2 同一目标 UUID 从 accepted 进入</w:t>
       </w:r>
       <w:r>
         <w:t xml:space="preserve"> </w:t>
@@ -9216,37 +9558,19 @@
         <w:rPr>
           <w:rStyle w:val="VerbatimChar"/>
         </w:rPr>
-        <w:t xml:space="preserve">EXECUTING</w:t>
-      </w:r>
-      <w:r>
-        <w:t xml:space="preserve"> </w:t>
-      </w:r>
-      <w:r>
-        <w:t xml:space="preserve">进入</w:t>
-      </w:r>
-      <w:r>
-        <w:t xml:space="preserve"> </w:t>
-      </w:r>
-      <w:r>
-        <w:rPr>
-          <w:rStyle w:val="VerbatimChar"/>
-        </w:rPr>
-        <w:t xml:space="preserve">SUCCEEDED</w:t>
-      </w:r>
-      <w:r>
-        <w:t xml:space="preserve">，机器人最终距目标 0.215 m。因此，课程提出的</w:t>
+        <w:t xml:space="preserve">SUCCEEDED (4)</w:t>
+      </w:r>
+      <w:r>
+        <w:t xml:space="preserve">，目标检查器在 0.25 m 位置容差内通过。因此，课程提出的</w:t>
+      </w:r>
+      <w:r>
+        <w:t xml:space="preserve"> </w:t>
       </w:r>
       <w:r>
         <w:t xml:space="preserve">“</w:t>
       </w:r>
       <w:r>
-        <w:t xml:space="preserve">在 Ignition Gazebo</w:t>
-      </w:r>
-      <w:r>
-        <w:t xml:space="preserve"> </w:t>
-      </w:r>
-      <w:r>
-        <w:t xml:space="preserve">仿真环境中实现 TurtleBot4 自主导航</w:t>
+        <w:t xml:space="preserve">在 Ignition Gazebo 仿真环境中实现 TurtleBot4 自主导航</w:t>
       </w:r>
       <w:r>
         <w:t xml:space="preserve">”</w:t>
@@ -9261,34 +9585,19 @@
         <w:spacing w:line="360" w:lineRule="auto"/>
       </w:pPr>
       <w:r>
-        <w:t xml:space="preserve">测试主机性能不足造成一次超过 10 s 的</w:t>
-      </w:r>
-      <w:r>
-        <w:t xml:space="preserve"> </w:t>
-      </w:r>
-      <w:r>
-        <w:rPr>
-          <w:rStyle w:val="VerbatimChar"/>
-        </w:rPr>
-        <w:t xml:space="preserve">/clock</w:t>
-      </w:r>
-      <w:r>
-        <w:t xml:space="preserve"> </w:t>
-      </w:r>
-      <w:r>
-        <w:t xml:space="preserve">监听间隙，但时钟随后恢复且</w:t>
-      </w:r>
-      <w:r>
-        <w:t xml:space="preserve"> </w:t>
-      </w:r>
-      <w:r>
-        <w:t xml:space="preserve">导航成功结束。该问题说明系统在低配、软件渲染环境下的实时性仍需优化，不否定自主</w:t>
-      </w:r>
-      <w:r>
-        <w:t xml:space="preserve"> </w:t>
-      </w:r>
-      <w:r>
-        <w:t xml:space="preserve">导航功能的完成结论。报告对这一限制进行了保守披露，并提供默认配置复测建议。</w:t>
+        <w:t xml:space="preserve">最终运行通过 120 s 的时钟和扫描启动验证；VMware 软件渲染下仍出现过可自行恢复的</w:t>
+      </w:r>
+      <w:r>
+        <w:t xml:space="preserve"> </w:t>
+      </w:r>
+      <w:r>
+        <w:t xml:space="preserve">RViz 短暂灰显。报告保守地区分了已保存的连续性证据、显示性能现象和动作终态，</w:t>
+      </w:r>
+      <w:r>
+        <w:t xml:space="preserve"> </w:t>
+      </w:r>
+      <w:r>
+        <w:t xml:space="preserve">并提供默认配置复测建议。</w:t>
       </w:r>
     </w:p>
     <w:p>
@@ -9328,7 +9637,7 @@
       <w:r>
         <w:t xml:space="preserve"> </w:t>
       </w:r>
-      <w:hyperlink r:id="rId79">
+      <w:hyperlink r:id="rId80">
         <w:r>
           <w:rPr>
             <w:rStyle w:val="Hyperlink"/>
@@ -9364,7 +9673,7 @@
       <w:r>
         <w:t xml:space="preserve"> </w:t>
       </w:r>
-      <w:hyperlink r:id="rId80">
+      <w:hyperlink r:id="rId81">
         <w:r>
           <w:rPr>
             <w:rStyle w:val="Hyperlink"/>
@@ -9400,7 +9709,7 @@
       <w:r>
         <w:t xml:space="preserve"> </w:t>
       </w:r>
-      <w:hyperlink r:id="rId81">
+      <w:hyperlink r:id="rId82">
         <w:r>
           <w:rPr>
             <w:rStyle w:val="Hyperlink"/>
@@ -9436,7 +9745,7 @@
       <w:r>
         <w:t xml:space="preserve"> </w:t>
       </w:r>
-      <w:hyperlink r:id="rId82">
+      <w:hyperlink r:id="rId83">
         <w:r>
           <w:rPr>
             <w:rStyle w:val="Hyperlink"/>
@@ -9646,7 +9955,7 @@
           <w:rFonts w:ascii="Consolas" w:hAnsi="Consolas" w:eastAsia="Consolas"/>
           <w:sz w:val="18"/>
         </w:rPr>
-        <w:t xml:space="preserve"> launch tb4_experiment_bringup simulation.launch.py slam:=false</w:t>
+        <w:t xml:space="preserve"> run tb4_experiment_bringup vmware_simulation start_nav2:=false</w:t>
       </w:r>
     </w:p>
     <w:p>
@@ -9655,7 +9964,7 @@
         <w:spacing w:line="360" w:lineRule="auto"/>
       </w:pPr>
       <w:r>
-        <w:t xml:space="preserve">在 RViz 中依次使用</w:t>
+        <w:t xml:space="preserve">在 RViz 中使用</w:t>
       </w:r>
       <w:r>
         <w:t xml:space="preserve"> </w:t>
@@ -9667,10 +9976,7 @@
         <w:t xml:space="preserve">2D Pose Estimate</w:t>
       </w:r>
       <w:r>
-        <w:t xml:space="preserve"> </w:t>
-      </w:r>
-      <w:r>
-        <w:t xml:space="preserve">和</w:t>
+        <w:t xml:space="preserve">，确认</w:t>
       </w:r>
       <w:r>
         <w:t xml:space="preserve"> </w:t>
@@ -9679,19 +9985,13 @@
         <w:rPr>
           <w:rStyle w:val="VerbatimChar"/>
         </w:rPr>
-        <w:t xml:space="preserve">Nav2 Goal</w:t>
-      </w:r>
-      <w:r>
-        <w:t xml:space="preserve">。</w:t>
-      </w:r>
-    </w:p>
-    <w:p>
-      <w:pPr>
-        <w:pStyle w:val="Heading2"/>
-        <w:ind w:firstLine="0"/>
-      </w:pPr>
-      <w:r>
-        <w:t>A.2  建图模式</w:t>
+        <w:t xml:space="preserve">map -&gt; odom</w:t>
+      </w:r>
+      <w:r>
+        <w:t xml:space="preserve"> </w:t>
+      </w:r>
+      <w:r>
+        <w:t xml:space="preserve">后，另开终端：</w:t>
       </w:r>
     </w:p>
     <w:p>
@@ -9748,6 +10048,30 @@
       </w:r>
       <w:r>
         <w:rPr>
+          <w:rStyle w:val="VariableTok"/>
+          <w:rFonts w:ascii="Consolas" w:hAnsi="Consolas" w:eastAsia="Consolas"/>
+          <w:sz w:val="18"/>
+        </w:rPr>
+        <w:t xml:space="preserve">PARAMS=</w:t>
+      </w:r>
+      <w:r>
+        <w:rPr>
+          <w:rStyle w:val="StringTok"/>
+          <w:rFonts w:ascii="Consolas" w:hAnsi="Consolas" w:eastAsia="Consolas"/>
+          <w:sz w:val="18"/>
+        </w:rPr>
+        <w:t xml:space="preserve">"</w:t>
+      </w:r>
+      <w:r>
+        <w:rPr>
+          <w:rStyle w:val="VariableTok"/>
+          <w:rFonts w:ascii="Consolas" w:hAnsi="Consolas" w:eastAsia="Consolas"/>
+          <w:sz w:val="18"/>
+        </w:rPr>
+        <w:t xml:space="preserve">$(</w:t>
+      </w:r>
+      <w:r>
+        <w:rPr>
           <w:rStyle w:val="ExtensionTok"/>
           <w:rFonts w:ascii="Consolas" w:hAnsi="Consolas" w:eastAsia="Consolas"/>
           <w:sz w:val="18"/>
@@ -9760,46 +10084,187 @@
           <w:rFonts w:ascii="Consolas" w:hAnsi="Consolas" w:eastAsia="Consolas"/>
           <w:sz w:val="18"/>
         </w:rPr>
-        <w:t xml:space="preserve"> launch tb4_experiment_bringup simulation.launch.py slam:=true</w:t>
+        <w:t xml:space="preserve"> pkg prefix tb4_experiment_bringup</w:t>
+      </w:r>
+      <w:r>
+        <w:rPr>
+          <w:rStyle w:val="VariableTok"/>
+          <w:rFonts w:ascii="Consolas" w:hAnsi="Consolas" w:eastAsia="Consolas"/>
+          <w:sz w:val="18"/>
+        </w:rPr>
+        <w:t xml:space="preserve">)</w:t>
+      </w:r>
+      <w:r>
+        <w:rPr>
+          <w:rStyle w:val="StringTok"/>
+          <w:rFonts w:ascii="Consolas" w:hAnsi="Consolas" w:eastAsia="Consolas"/>
+          <w:sz w:val="18"/>
+        </w:rPr>
+        <w:t xml:space="preserve">/share/\</w:t>
+      </w:r>
+      <w:r>
+        <w:rPr>
+          <w:rFonts w:ascii="Consolas" w:hAnsi="Consolas" w:eastAsia="Consolas"/>
+          <w:sz w:val="18"/>
+        </w:rPr>
+        <w:br/>
+      </w:r>
+      <w:r>
+        <w:rPr>
+          <w:rStyle w:val="StringTok"/>
+          <w:rFonts w:ascii="Consolas" w:hAnsi="Consolas" w:eastAsia="Consolas"/>
+          <w:sz w:val="18"/>
+        </w:rPr>
+        <w:t xml:space="preserve">tb4_experiment_bringup/config/nav2_astar.yaml"</w:t>
+      </w:r>
+      <w:r>
+        <w:rPr>
+          <w:rFonts w:ascii="Consolas" w:hAnsi="Consolas" w:eastAsia="Consolas"/>
+          <w:sz w:val="18"/>
+        </w:rPr>
+        <w:br/>
+      </w:r>
+      <w:r>
+        <w:rPr>
+          <w:rStyle w:val="ExtensionTok"/>
+          <w:rFonts w:ascii="Consolas" w:hAnsi="Consolas" w:eastAsia="Consolas"/>
+          <w:sz w:val="18"/>
+        </w:rPr>
+        <w:t xml:space="preserve">ros2</w:t>
+      </w:r>
+      <w:r>
+        <w:rPr>
+          <w:rStyle w:val="NormalTok"/>
+          <w:rFonts w:ascii="Consolas" w:hAnsi="Consolas" w:eastAsia="Consolas"/>
+          <w:sz w:val="18"/>
+        </w:rPr>
+        <w:t xml:space="preserve"> launch turtlebot4_navigation nav2.launch.py </w:t>
+      </w:r>
+      <w:r>
+        <w:rPr>
+          <w:rStyle w:val="KeywordTok"/>
+          <w:rFonts w:ascii="Consolas" w:hAnsi="Consolas" w:eastAsia="Consolas"/>
+          <w:sz w:val="18"/>
+        </w:rPr>
+        <w:t xml:space="preserve">\</w:t>
+      </w:r>
+      <w:r>
+        <w:rPr>
+          <w:rFonts w:ascii="Consolas" w:hAnsi="Consolas" w:eastAsia="Consolas"/>
+          <w:sz w:val="18"/>
+        </w:rPr>
+        <w:br/>
+      </w:r>
+      <w:r>
+        <w:rPr>
+          <w:rStyle w:val="NormalTok"/>
+          <w:rFonts w:ascii="Consolas" w:hAnsi="Consolas" w:eastAsia="Consolas"/>
+          <w:sz w:val="18"/>
+        </w:rPr>
+        <w:t xml:space="preserve">  </w:t>
+      </w:r>
+      <w:r>
+        <w:rPr>
+          <w:rStyle w:val="ExtensionTok"/>
+          <w:rFonts w:ascii="Consolas" w:hAnsi="Consolas" w:eastAsia="Consolas"/>
+          <w:sz w:val="18"/>
+        </w:rPr>
+        <w:t xml:space="preserve">use_sim_time</w:t>
+      </w:r>
+      <w:r>
+        <w:rPr>
+          <w:rStyle w:val="NormalTok"/>
+          <w:rFonts w:ascii="Consolas" w:hAnsi="Consolas" w:eastAsia="Consolas"/>
+          <w:sz w:val="18"/>
+        </w:rPr>
+        <w:t xml:space="preserve">:=true params_file:=</w:t>
+      </w:r>
+      <w:r>
+        <w:rPr>
+          <w:rStyle w:val="StringTok"/>
+          <w:rFonts w:ascii="Consolas" w:hAnsi="Consolas" w:eastAsia="Consolas"/>
+          <w:sz w:val="18"/>
+        </w:rPr>
+        <w:t xml:space="preserve">"</w:t>
+      </w:r>
+      <w:r>
+        <w:rPr>
+          <w:rStyle w:val="VariableTok"/>
+          <w:rFonts w:ascii="Consolas" w:hAnsi="Consolas" w:eastAsia="Consolas"/>
+          <w:sz w:val="18"/>
+        </w:rPr>
+        <w:t xml:space="preserve">$PARAMS</w:t>
+      </w:r>
+      <w:r>
+        <w:rPr>
+          <w:rStyle w:val="StringTok"/>
+          <w:rFonts w:ascii="Consolas" w:hAnsi="Consolas" w:eastAsia="Consolas"/>
+          <w:sz w:val="18"/>
+        </w:rPr>
+        <w:t xml:space="preserve">"</w:t>
       </w:r>
     </w:p>
     <w:p>
       <w:pPr>
+        <w:pStyle w:val="FirstParagraph"/>
+        <w:spacing w:line="360" w:lineRule="auto"/>
+      </w:pPr>
+      <w:r>
+        <w:t xml:space="preserve">Planner、Controller 与 BT Navigator 均为</w:t>
+      </w:r>
+      <w:r>
+        <w:t xml:space="preserve"> </w:t>
+      </w:r>
+      <w:r>
+        <w:rPr>
+          <w:rStyle w:val="VerbatimChar"/>
+        </w:rPr>
+        <w:t xml:space="preserve">active [3]</w:t>
+      </w:r>
+      <w:r>
+        <w:t xml:space="preserve"> </w:t>
+      </w:r>
+      <w:r>
+        <w:t xml:space="preserve">后，再使用 RViz</w:t>
+      </w:r>
+      <w:r>
+        <w:t xml:space="preserve"> </w:t>
+      </w:r>
+      <w:r>
+        <w:rPr>
+          <w:rStyle w:val="VerbatimChar"/>
+        </w:rPr>
+        <w:t xml:space="preserve">Nav2 Goal</w:t>
+      </w:r>
+      <w:r>
+        <w:t xml:space="preserve"> </w:t>
+      </w:r>
+      <w:r>
+        <w:t xml:space="preserve">或</w:t>
+      </w:r>
+      <w:r>
+        <w:t xml:space="preserve"> </w:t>
+      </w:r>
+      <w:r>
+        <w:rPr>
+          <w:rStyle w:val="VerbatimChar"/>
+        </w:rPr>
+        <w:t xml:space="preserve">ros2 action send_goal</w:t>
+      </w:r>
+      <w:r>
+        <w:t xml:space="preserve"> </w:t>
+      </w:r>
+      <w:r>
+        <w:t xml:space="preserve">发送唯一目标。</w:t>
+      </w:r>
+    </w:p>
+    <w:p>
+      <w:pPr>
         <w:pStyle w:val="Heading2"/>
         <w:ind w:firstLine="0"/>
       </w:pPr>
       <w:r>
-        <w:t>A.3  低负载复测模式</w:t>
-      </w:r>
-    </w:p>
-    <w:p>
-      <w:pPr>
-        <w:pStyle w:val="FirstParagraph"/>
-        <w:spacing w:line="360" w:lineRule="auto"/>
-      </w:pPr>
-      <w:r>
-        <w:t xml:space="preserve">低配主机可自行复制官方 warehouse SDF 并降低传感器更新率，然后通过</w:t>
-      </w:r>
-      <w:r>
-        <w:t xml:space="preserve"> </w:t>
-      </w:r>
-      <w:r>
-        <w:rPr>
-          <w:rStyle w:val="VerbatimChar"/>
-        </w:rPr>
-        <w:t xml:space="preserve">gz_args</w:t>
-      </w:r>
-      <w:r>
-        <w:t xml:space="preserve"> </w:t>
-      </w:r>
-      <w:r>
-        <w:t xml:space="preserve">指向该临时文件；临时 overlay 不属于课程源码，提交包不将其作为</w:t>
-      </w:r>
-      <w:r>
-        <w:t xml:space="preserve"> </w:t>
-      </w:r>
-      <w:r>
-        <w:t xml:space="preserve">默认运行前提。</w:t>
+        <w:t>A.2  建图模式</w:t>
       </w:r>
     </w:p>
     <w:p>
@@ -9814,7 +10279,7 @@
           <w:rFonts w:ascii="Consolas" w:hAnsi="Consolas" w:eastAsia="Consolas"/>
           <w:sz w:val="18"/>
         </w:rPr>
-        <w:t xml:space="preserve">export</w:t>
+        <w:t xml:space="preserve">source</w:t>
       </w:r>
       <w:r>
         <w:rPr>
@@ -9822,15 +10287,22 @@
           <w:rFonts w:ascii="Consolas" w:hAnsi="Consolas" w:eastAsia="Consolas"/>
           <w:sz w:val="18"/>
         </w:rPr>
-        <w:t xml:space="preserve"> </w:t>
-      </w:r>
-      <w:r>
-        <w:rPr>
-          <w:rStyle w:val="VariableTok"/>
+        <w:t xml:space="preserve"> /opt/ros/humble/setup.bash</w:t>
+      </w:r>
+      <w:r>
+        <w:rPr>
           <w:rFonts w:ascii="Consolas" w:hAnsi="Consolas" w:eastAsia="Consolas"/>
           <w:sz w:val="18"/>
         </w:rPr>
-        <w:t xml:space="preserve">AMENT_PREFIX_PATH=</w:t>
+        <w:br/>
+      </w:r>
+      <w:r>
+        <w:rPr>
+          <w:rStyle w:val="BuiltInTok"/>
+          <w:rFonts w:ascii="Consolas" w:hAnsi="Consolas" w:eastAsia="Consolas"/>
+          <w:sz w:val="18"/>
+        </w:rPr>
+        <w:t xml:space="preserve">source</w:t>
       </w:r>
       <w:r>
         <w:rPr>
@@ -9838,15 +10310,7 @@
           <w:rFonts w:ascii="Consolas" w:hAnsi="Consolas" w:eastAsia="Consolas"/>
           <w:sz w:val="18"/>
         </w:rPr>
-        <w:t xml:space="preserve">/path/to/temporary/overlay:</w:t>
-      </w:r>
-      <w:r>
-        <w:rPr>
-          <w:rStyle w:val="VariableTok"/>
-          <w:rFonts w:ascii="Consolas" w:hAnsi="Consolas" w:eastAsia="Consolas"/>
-          <w:sz w:val="18"/>
-        </w:rPr>
-        <w:t xml:space="preserve">$AMENT_PREFIX_PATH</w:t>
+        <w:t xml:space="preserve"> experiment2/ros2_ws/install/setup.bash</w:t>
       </w:r>
       <w:r>
         <w:rPr>
@@ -9869,22 +10333,73 @@
           <w:rFonts w:ascii="Consolas" w:hAnsi="Consolas" w:eastAsia="Consolas"/>
           <w:sz w:val="18"/>
         </w:rPr>
-        <w:t xml:space="preserve"> launch tb4_experiment_bringup simulation.launch.py </w:t>
-      </w:r>
-      <w:r>
-        <w:rPr>
-          <w:rStyle w:val="KeywordTok"/>
+        <w:t xml:space="preserve"> run tb4_experiment_bringup vmware_simulation slam:=true</w:t>
+      </w:r>
+    </w:p>
+    <w:p>
+      <w:pPr>
+        <w:pStyle w:val="Heading2"/>
+        <w:ind w:firstLine="0"/>
+      </w:pPr>
+      <w:r>
+        <w:t>A.3  低负载预设</w:t>
+      </w:r>
+    </w:p>
+    <w:p>
+      <w:pPr>
+        <w:pStyle w:val="FirstParagraph"/>
+        <w:spacing w:line="360" w:lineRule="auto"/>
+      </w:pPr>
+      <w:r>
+        <w:t xml:space="preserve">提交代码提供</w:t>
+      </w:r>
+      <w:r>
+        <w:t xml:space="preserve"> </w:t>
+      </w:r>
+      <w:r>
+        <w:rPr>
+          <w:rStyle w:val="VerbatimChar"/>
+        </w:rPr>
+        <w:t xml:space="preserve">vmware_simulation</w:t>
+      </w:r>
+      <w:r>
+        <w:t xml:space="preserve"> </w:t>
+      </w:r>
+      <w:r>
+        <w:t xml:space="preserve">脚本；它只在用户缓存目录生成 overlay，</w:t>
+      </w:r>
+      <w:r>
+        <w:t xml:space="preserve"> </w:t>
+      </w:r>
+      <w:r>
+        <w:t xml:space="preserve">不修改仓库或</w:t>
+      </w:r>
+      <w:r>
+        <w:t xml:space="preserve"> </w:t>
+      </w:r>
+      <w:r>
+        <w:rPr>
+          <w:rStyle w:val="VerbatimChar"/>
+        </w:rPr>
+        <w:t xml:space="preserve">/opt/ros/humble</w:t>
+      </w:r>
+      <w:r>
+        <w:t xml:space="preserve">：</w:t>
+      </w:r>
+    </w:p>
+    <w:p>
+      <w:pPr>
+        <w:pStyle w:val="SourceCode"/>
+        <w:spacing w:before="80" w:after="80"/>
+        <w:ind w:firstLine="0"/>
+      </w:pPr>
+      <w:r>
+        <w:rPr>
+          <w:rStyle w:val="ExtensionTok"/>
           <w:rFonts w:ascii="Consolas" w:hAnsi="Consolas" w:eastAsia="Consolas"/>
           <w:sz w:val="18"/>
         </w:rPr>
-        <w:t xml:space="preserve">\</w:t>
-      </w:r>
-      <w:r>
-        <w:rPr>
-          <w:rFonts w:ascii="Consolas" w:hAnsi="Consolas" w:eastAsia="Consolas"/>
-          <w:sz w:val="18"/>
-        </w:rPr>
-        <w:br/>
+        <w:t xml:space="preserve">ros2</w:t>
       </w:r>
       <w:r>
         <w:rPr>
@@ -9892,70 +10407,7 @@
           <w:rFonts w:ascii="Consolas" w:hAnsi="Consolas" w:eastAsia="Consolas"/>
           <w:sz w:val="18"/>
         </w:rPr>
-        <w:t xml:space="preserve">  </w:t>
-      </w:r>
-      <w:r>
-        <w:rPr>
-          <w:rStyle w:val="ExtensionTok"/>
-          <w:rFonts w:ascii="Consolas" w:hAnsi="Consolas" w:eastAsia="Consolas"/>
-          <w:sz w:val="18"/>
-        </w:rPr>
-        <w:t xml:space="preserve">slam</w:t>
-      </w:r>
-      <w:r>
-        <w:rPr>
-          <w:rStyle w:val="NormalTok"/>
-          <w:rFonts w:ascii="Consolas" w:hAnsi="Consolas" w:eastAsia="Consolas"/>
-          <w:sz w:val="18"/>
-        </w:rPr>
-        <w:t xml:space="preserve">:=false </w:t>
-      </w:r>
-      <w:r>
-        <w:rPr>
-          <w:rStyle w:val="KeywordTok"/>
-          <w:rFonts w:ascii="Consolas" w:hAnsi="Consolas" w:eastAsia="Consolas"/>
-          <w:sz w:val="18"/>
-        </w:rPr>
-        <w:t xml:space="preserve">\</w:t>
-      </w:r>
-      <w:r>
-        <w:rPr>
-          <w:rFonts w:ascii="Consolas" w:hAnsi="Consolas" w:eastAsia="Consolas"/>
-          <w:sz w:val="18"/>
-        </w:rPr>
-        <w:br/>
-      </w:r>
-      <w:r>
-        <w:rPr>
-          <w:rStyle w:val="NormalTok"/>
-          <w:rFonts w:ascii="Consolas" w:hAnsi="Consolas" w:eastAsia="Consolas"/>
-          <w:sz w:val="18"/>
-        </w:rPr>
-        <w:t xml:space="preserve">  </w:t>
-      </w:r>
-      <w:r>
-        <w:rPr>
-          <w:rStyle w:val="ExtensionTok"/>
-          <w:rFonts w:ascii="Consolas" w:hAnsi="Consolas" w:eastAsia="Consolas"/>
-          <w:sz w:val="18"/>
-        </w:rPr>
-        <w:t xml:space="preserve">gz_args</w:t>
-      </w:r>
-      <w:r>
-        <w:rPr>
-          <w:rStyle w:val="NormalTok"/>
-          <w:rFonts w:ascii="Consolas" w:hAnsi="Consolas" w:eastAsia="Consolas"/>
-          <w:sz w:val="18"/>
-        </w:rPr>
-        <w:t xml:space="preserve">:=</w:t>
-      </w:r>
-      <w:r>
-        <w:rPr>
-          <w:rStyle w:val="StringTok"/>
-          <w:rFonts w:ascii="Consolas" w:hAnsi="Consolas" w:eastAsia="Consolas"/>
-          <w:sz w:val="18"/>
-        </w:rPr>
-        <w:t xml:space="preserve">"/absolute/path/to/warehouse-fast.sdf -r -s -v 2"</w:t>
+        <w:t xml:space="preserve"> run tb4_experiment_bringup vmware_simulation start_nav2:=false</w:t>
       </w:r>
     </w:p>
     <w:p>

</xml_diff>